<commit_message>
feat: configure npm bind host for private consumers
</commit_message>
<xml_diff>
--- a/docs/manuals/Media-Bridge-Integrated-Manual.docx
+++ b/docs/manuals/Media-Bridge-Integrated-Manual.docx
@@ -6910,6 +6910,33 @@
         <w:t>process rate-limit/event sink는 아직 검증하지 않았다.</w:t>
       </w:r>
     </w:p>
+    <w:p>
+      <w:pPr>
+        <w:pStyle w:val="Heading1"/>
+      </w:pPr>
+      <w:r>
+        <w:t>npm 설치 프로그램의 bind 주소 설정</w:t>
+      </w:r>
+    </w:p>
+    <w:p>
+      <w:r>
+        <w:t>Media Bridge npm 패키지는 기본적으로 127.0.0.1에만 bind됩니다. 같은 PC의 Docker 컨테이너가 호출해야 하면 설치한 PC에서 Docker bridge gateway를 확인한 뒤 해당 사설 IPv4를 저장합니다.</w:t>
+      </w:r>
+    </w:p>
+    <w:p>
+      <w:r>
+        <w:t>docker network inspect bridge --format '{{range .IPAM.Config}}{{.Gateway}}{{end}}'</w:t>
+        <w:br/>
+        <w:t>mb init --host 172.17.0.1 --port 8642</w:t>
+        <w:br/>
+        <w:t>mb service restart</w:t>
+      </w:r>
+    </w:p>
+    <w:p>
+      <w:r>
+        <w:t>172.17.0.1은 예시입니다. 첫 명령의 실제 결과를 --host에 사용하며, 127.0.0.1과 10.0.0.0/8, 172.16.0.0/12, 192.168.0.0/16 사설 IPv4만 허용됩니다. MB_HOST와 MB_PORT 환경변수로 비대화식 설정도 가능합니다. 설정은 사용자 홈에 저장되므로 다른 PC에 재설치해도 이 주소가 전역으로 적용되지 않습니다.</w:t>
+      </w:r>
+    </w:p>
     <w:sectPr>
       <w:footerReference w:type="default" r:id="rId9"/>
       <w:pgSz w:w="12240" w:h="15840"/>

</xml_diff>

<commit_message>
docs: clarify consumer-driven bind selection
</commit_message>
<xml_diff>
--- a/docs/manuals/Media-Bridge-Integrated-Manual.docx
+++ b/docs/manuals/Media-Bridge-Integrated-Manual.docx
@@ -6937,6 +6937,24 @@
         <w:t>172.17.0.1은 예시입니다. 첫 명령의 실제 결과를 --host에 사용하며, 127.0.0.1과 10.0.0.0/8, 172.16.0.0/12, 192.168.0.0/16 사설 IPv4만 허용됩니다. MB_HOST와 MB_PORT 환경변수로 비대화식 설정도 가능합니다. 설정은 사용자 홈에 저장되므로 다른 PC에 재설치해도 이 주소가 전역으로 적용되지 않습니다.</w:t>
       </w:r>
     </w:p>
+    <w:p>
+      <w:pPr>
+        <w:pStyle w:val="Heading1"/>
+      </w:pPr>
+      <w:r>
+        <w:t>설치 순서와 소비자 주소 결정</w:t>
+      </w:r>
+    </w:p>
+    <w:p>
+      <w:r>
+        <w:t>Media Bridge는 먼저 설치할 수 있지만 npm install만으로 네트워크 주소를 추측하거나 변경하지 않습니다. 설치 자동화는 npm 설치 후 실행 환경을 알고 있는 단계에서 mb init --host로 bind 주소를 전달하고, 이어서 Eoul Gateway가 같은 주소의 endpoint를 사용하도록 구성합니다.</w:t>
+      </w:r>
+    </w:p>
+    <w:p>
+      <w:r>
+        <w:t>호스트에서 직접 실행되는 Gateway는 127.0.0.1을 사용합니다. Docker Gateway는 Media Bridge가 실제로 Docker host gateway에서 수신하도록 설정된 경우에만 그 gateway 주소를 사용합니다. 이미 127.0.0.1에 bind된 Media Bridge에 endpoint만 172.17.0.1로 바꾸면 연결되지 않습니다.</w:t>
+      </w:r>
+    </w:p>
     <w:sectPr>
       <w:footerReference w:type="default" r:id="rId9"/>
       <w:pgSz w:w="12240" w:h="15840"/>

</xml_diff>

<commit_message>
docs: document user-local npm path setup
</commit_message>
<xml_diff>
--- a/docs/manuals/Media-Bridge-Integrated-Manual.docx
+++ b/docs/manuals/Media-Bridge-Integrated-Manual.docx
@@ -6955,6 +6955,37 @@
         <w:t>호스트에서 직접 실행되는 Gateway는 127.0.0.1을 사용합니다. Docker Gateway는 Media Bridge가 실제로 Docker host gateway에서 수신하도록 설정된 경우에만 그 gateway 주소를 사용합니다. 이미 127.0.0.1에 bind된 Media Bridge에 endpoint만 172.17.0.1로 바꾸면 연결되지 않습니다.</w:t>
       </w:r>
     </w:p>
+    <w:p>
+      <w:pPr>
+        <w:pStyle w:val="Heading1"/>
+      </w:pPr>
+      <w:r>
+        <w:t>권한 없는 Linux 계정의 npm 설치</w:t>
+      </w:r>
+    </w:p>
+    <w:p>
+      <w:r>
+        <w:t>시스템 전역 npm 경로에 쓸 권한이 없는 계정은 사용자 prefix를 지정하고 ~/.local/bin을 PATH에 등록합니다. sudo npm install -g로 우회하지 않습니다.</w:t>
+      </w:r>
+    </w:p>
+    <w:p>
+      <w:r>
+        <w:t>npm config set prefix "$HOME/.local"</w:t>
+        <w:br/>
+        <w:t>npm install -g @cyhuh/media-bridge</w:t>
+        <w:br/>
+        <w:t>echo 'export PATH="$HOME/.local/bin:$PATH"' &gt;&gt; "$HOME/.bashrc"</w:t>
+        <w:br/>
+        <w:t>export PATH="$HOME/.local/bin:$PATH"</w:t>
+        <w:br/>
+        <w:t>command -v mb</w:t>
+      </w:r>
+    </w:p>
+    <w:p>
+      <w:r>
+        <w:t>command -v mb가 경로를 출력하면 설치가 완료된 것입니다.</w:t>
+      </w:r>
+    </w:p>
     <w:sectPr>
       <w:footerReference w:type="default" r:id="rId9"/>
       <w:pgSz w:w="12240" w:h="15840"/>

</xml_diff>

<commit_message>
feat: configure provider reasoning effort
</commit_message>
<xml_diff>
--- a/docs/manuals/Media-Bridge-Integrated-Manual.docx
+++ b/docs/manuals/Media-Bridge-Integrated-Manual.docx
@@ -7245,7 +7245,7 @@
     </w:p>
     <w:p>
       <w:r>
-        <w:t>이 매뉴얼은 배포형 Media Bridge의 관리 콘솔에서 Provider, 라우팅, 모델, 정책, 접근 키, Snapshot, 연결을 등록하고 운영하는 방법을 설명합니다. Media Bridge는 미디어 입력을 검사·분석한 뒤 허용된 요청을 Non‑Vision LLM Provider로 전달하므로, 아래 순서대로 설정해야 실제 요청을 안전하게 처리할 수 있습니다.</w:t>
+        <w:t>이 매뉴얼은 배포형 Media Bridge의 관리 콘솔에서 Provider, 라우팅, 모델, 정책, 접근 키와 Snapshot을 등록하고 운영하는 방법을 설명합니다. Provider와 credential은 DB 설정을 정본으로 사용합니다. Media Bridge는 미디어 입력을 검사·분석한 뒤 허용된 요청을 Non-Vision LLM Provider로 전달합니다.</w:t>
       </w:r>
     </w:p>
     <w:p>
@@ -7493,7 +7493,7 @@
         <w:pStyle w:val="ListNumber"/>
       </w:pPr>
       <w:r>
-        <w:t>DB에 직접 저장할 API 키를 입력하거나, 환경변수 참조를 사용할 경우 환경변수 이름을 입력합니다.</w:t>
+        <w:t>Provider API 키를 기존 DB credential 관리 경로로 저장하거나 이미 등록된 DB credential을 선택합니다. 새 Secret 파일은 요구하지 않습니다.</w:t>
       </w:r>
     </w:p>
     <w:p>
@@ -7527,7 +7527,45 @@
     </w:p>
     <w:p>
       <w:r>
-        <w:t>API 키를 입력하면 키 원문은 DB에 암호화되어 저장되고 목록에는 원문이나 내부 식별자를 표시하지 않습니다. 환경변수 참조를 직접 사용하는 경우에만 PROVIDER_API_KEY처럼 대문자와 숫자, 밑줄을 사용합니다.</w:t>
+        <w:t>Provider API 키는 DB에서 암호화해 보관하며, 관리 화면은 원문을 다시 표시하지 않습니다. Gateway는 Provider ID를 기준으로 DB credential을 조회하므로 별도의 Gateway Secret 파일을 추가할 필요가 없습니다.</w:t>
+      </w:r>
+    </w:p>
+    <w:p>
+      <w:pPr>
+        <w:pStyle w:val="Heading2"/>
+      </w:pPr>
+      <w:r>
+        <w:t>Non-Vision LLM 추론 등급</w:t>
+      </w:r>
+    </w:p>
+    <w:p>
+      <w:pPr/>
+      <w:r>
+        <w:t>추론 등급은 Provider 유형이 Non-Vision LLM일 때만 설정합니다. 선택한 Provider, API 프로토콜, 모델 조합이 지원하는 선택지만 표시됩니다. Upstage Solar solar-pro3 및 solar-pro4의 Chat Completions 조합은 low, medium, high를 지원합니다.</w:t>
+      </w:r>
+    </w:p>
+    <w:p>
+      <w:pPr/>
+      <w:r>
+        <w:t>Provider 기본값은 추론 파라미터를 요청에 추가하지 않고 Provider의 기본 동작을 사용합니다. 기존 설정도 이 값을 기본으로 유지합니다.</w:t>
+      </w:r>
+    </w:p>
+    <w:p>
+      <w:pPr/>
+      <w:r>
+        <w:t>배포형에서는 설정 저장 후 새 Snapshot을 발행해야 Gateway 요청에 적용됩니다. 설치형에서는 LLM 연결 시험과 전체 흐름 시험이 저장된 동일한 추론 등급을 사용합니다.</w:t>
+      </w:r>
+    </w:p>
+    <w:p>
+      <w:pPr/>
+      <w:r>
+        <w:t>모델 또는 프로토콜 변경으로 기존 등급이 지원되지 않으면 자동 대체하지 않습니다. 지원되는 값이나 Provider 기본값을 명시적으로 선택해야 저장할 수 있습니다.</w:t>
+      </w:r>
+    </w:p>
+    <w:p>
+      <w:pPr/>
+      <w:r>
+        <w:t>추론 등급은 분석 Provider, 미디어 변환 또는 분석 Provider와 Non-Vision LLM의 N:N 라우팅을 변경하지 않습니다.</w:t>
       </w:r>
     </w:p>
     <w:p>
@@ -8046,112 +8084,6 @@
     <w:p>
       <w:r>
         <w:t>잘못된 설정을 발행한 경우 Snapshot 목록에서 원하는 버전의 이 버전으로 rollback을 선택합니다. Snapshot 발행과 rollback은 관리자만 수행할 수 있습니다.</w:t>
-      </w:r>
-    </w:p>
-    <w:p>
-      <w:pPr>
-        <w:pStyle w:val="Heading3"/>
-      </w:pPr>
-      <w:r>
-        <w:t>연결</w:t>
-      </w:r>
-    </w:p>
-    <w:p>
-      <w:r>
-        <w:t>연결 메뉴는 외부 Gateway 또는 다른 Media Bridge 인스턴스의 HTTPS Endpoint와 인증 Secret 참조를 관리합니다. Provider 등록과는 별개의 기능입니다.</w:t>
-      </w:r>
-    </w:p>
-    <w:p>
-      <w:pPr>
-        <w:pStyle w:val="Heading3"/>
-      </w:pPr>
-      <w:r>
-        <w:t>등록 항목</w:t>
-      </w:r>
-    </w:p>
-    <w:p>
-      <w:pPr>
-        <w:pStyle w:val="ListBullet"/>
-      </w:pPr>
-      <w:r>
-        <w:t>이름: 연결 대상의 구분 이름</w:t>
-      </w:r>
-    </w:p>
-    <w:p>
-      <w:pPr>
-        <w:pStyle w:val="ListBullet"/>
-      </w:pPr>
-      <w:r>
-        <w:t>Gateway HTTPS URL: https://로 시작하는 외부 Endpoint</w:t>
-      </w:r>
-    </w:p>
-    <w:p>
-      <w:pPr>
-        <w:pStyle w:val="ListBullet"/>
-      </w:pPr>
-      <w:r>
-        <w:t>Secret 참조 종류:</w:t>
-      </w:r>
-    </w:p>
-    <w:p>
-      <w:pPr>
-        <w:pStyle w:val="ListBullet"/>
-      </w:pPr>
-      <w:r>
-        <w:t>환경변수</w:t>
-      </w:r>
-    </w:p>
-    <w:p>
-      <w:pPr>
-        <w:pStyle w:val="ListBullet"/>
-      </w:pPr>
-      <w:r>
-        <w:t>Docker Secret</w:t>
-      </w:r>
-    </w:p>
-    <w:p>
-      <w:pPr>
-        <w:pStyle w:val="ListBullet"/>
-      </w:pPr>
-      <w:r>
-        <w:t>외부 Secret Store</w:t>
-      </w:r>
-    </w:p>
-    <w:p>
-      <w:pPr>
-        <w:pStyle w:val="ListBullet"/>
-      </w:pPr>
-      <w:r>
-        <w:t>Secret 식별자: 선택한 참조 종류에 맞는 식별자</w:t>
-      </w:r>
-    </w:p>
-    <w:p>
-      <w:r>
-        <w:t>예를 들어 OmniRoute 배포형을 연결할 때는 다음처럼 입력합니다.</w:t>
-      </w:r>
-    </w:p>
-    <w:p>
-      <w:pPr>
-        <w:pStyle w:val="NoSpacing"/>
-        <w:ind w:left="360"/>
-      </w:pPr>
-      <w:r>
-        <w:rPr>
-          <w:rFonts w:ascii="Consolas" w:hAnsi="Consolas"/>
-          <w:sz w:val="18"/>
-        </w:rPr>
-        <w:t>이름: OmniRoute 배포형</w:t>
-        <w:br/>
-        <w:t>Gateway HTTPS URL: https://omniroute.sinsan.kr/v1</w:t>
-        <w:br/>
-        <w:t>Secret 참조 종류: 환경변수</w:t>
-        <w:br/>
-        <w:t>Secret 식별자: OMNIROUTE_API_KEY</w:t>
-      </w:r>
-    </w:p>
-    <w:p>
-      <w:r>
-        <w:t>등록 후 연결 시험을 실행해 Endpoint와 Secret 참조가 정상인지 확인합니다. 연결 시험은 operator도 수행할 수 있지만 등록·폐기는 관리자만 수행합니다.</w:t>
       </w:r>
     </w:p>
     <w:p>

</xml_diff>